<commit_message>
:mongoDB : Notes :
</commit_message>
<xml_diff>
--- a/DBMS/Database.docx
+++ b/DBMS/Database.docx
@@ -14058,17 +14058,7 @@
           <w:sz w:val="28"/>
           <w:szCs w:val="28"/>
         </w:rPr>
-        <w:t>1</w:t>
-      </w:r>
-      <w:r>
-        <w:rPr>
-          <w:rFonts w:ascii="Times New Roman" w:hAnsi="Times New Roman" w:cs="Times New Roman"/>
-          <w:b/>
-          <w:bCs/>
-          <w:sz w:val="28"/>
-          <w:szCs w:val="28"/>
-        </w:rPr>
-        <w:t>️</w:t>
+        <w:t>1️</w:t>
       </w:r>
       <w:r>
         <w:rPr>
@@ -14088,17 +14078,7 @@
           <w:sz w:val="28"/>
           <w:szCs w:val="28"/>
         </w:rPr>
-        <w:t xml:space="preserve"> Types</w:t>
-      </w:r>
-      <w:r>
-        <w:rPr>
-          <w:rFonts w:ascii="Times New Roman" w:hAnsi="Times New Roman" w:cs="Times New Roman"/>
-          <w:b/>
-          <w:bCs/>
-          <w:sz w:val="28"/>
-          <w:szCs w:val="28"/>
-        </w:rPr>
-        <w:t xml:space="preserve"> of Joins</w:t>
+        <w:t xml:space="preserve"> Types of Joins</w:t>
       </w:r>
     </w:p>
     <w:p>
@@ -14367,17 +14347,7 @@
           <w:sz w:val="28"/>
           <w:szCs w:val="28"/>
         </w:rPr>
-        <w:t>2</w:t>
-      </w:r>
-      <w:r>
-        <w:rPr>
-          <w:rFonts w:ascii="Times New Roman" w:hAnsi="Times New Roman" w:cs="Times New Roman"/>
-          <w:b/>
-          <w:bCs/>
-          <w:sz w:val="28"/>
-          <w:szCs w:val="28"/>
-        </w:rPr>
-        <w:t>️</w:t>
+        <w:t>2️</w:t>
       </w:r>
       <w:r>
         <w:rPr>
@@ -14397,17 +14367,7 @@
           <w:sz w:val="28"/>
           <w:szCs w:val="28"/>
         </w:rPr>
-        <w:t xml:space="preserve"> Sample</w:t>
-      </w:r>
-      <w:r>
-        <w:rPr>
-          <w:rFonts w:ascii="Times New Roman" w:hAnsi="Times New Roman" w:cs="Times New Roman"/>
-          <w:b/>
-          <w:bCs/>
-          <w:sz w:val="28"/>
-          <w:szCs w:val="28"/>
-        </w:rPr>
-        <w:t xml:space="preserve"> Tables</w:t>
+        <w:t xml:space="preserve"> Sample Tables</w:t>
       </w:r>
     </w:p>
     <w:p>
@@ -15276,17 +15236,7 @@
           <w:sz w:val="28"/>
           <w:szCs w:val="28"/>
         </w:rPr>
-        <w:t>3</w:t>
-      </w:r>
-      <w:r>
-        <w:rPr>
-          <w:rFonts w:ascii="Times New Roman" w:hAnsi="Times New Roman" w:cs="Times New Roman"/>
-          <w:b/>
-          <w:bCs/>
-          <w:sz w:val="28"/>
-          <w:szCs w:val="28"/>
-        </w:rPr>
-        <w:t>️</w:t>
+        <w:t>3️</w:t>
       </w:r>
       <w:r>
         <w:rPr>
@@ -15306,17 +15256,7 @@
           <w:sz w:val="28"/>
           <w:szCs w:val="28"/>
         </w:rPr>
-        <w:t xml:space="preserve"> INNER</w:t>
-      </w:r>
-      <w:r>
-        <w:rPr>
-          <w:rFonts w:ascii="Times New Roman" w:hAnsi="Times New Roman" w:cs="Times New Roman"/>
-          <w:b/>
-          <w:bCs/>
-          <w:sz w:val="28"/>
-          <w:szCs w:val="28"/>
-        </w:rPr>
-        <w:t xml:space="preserve"> JOIN (Only Matching Records)</w:t>
+        <w:t xml:space="preserve"> INNER JOIN (Only Matching Records)</w:t>
       </w:r>
     </w:p>
     <w:p>
@@ -15359,6 +15299,7 @@
     </w:p>
     <w:p>
       <w:pPr>
+        <w:shd w:val="clear" w:color="auto" w:fill="E2EFD9" w:themeFill="accent6" w:themeFillTint="33"/>
         <w:tabs>
           <w:tab w:val="left" w:pos="6768"/>
         </w:tabs>
@@ -15397,6 +15338,7 @@
     </w:p>
     <w:p>
       <w:pPr>
+        <w:shd w:val="clear" w:color="auto" w:fill="E2EFD9" w:themeFill="accent6" w:themeFillTint="33"/>
         <w:tabs>
           <w:tab w:val="left" w:pos="6768"/>
         </w:tabs>
@@ -15417,6 +15359,7 @@
     </w:p>
     <w:p>
       <w:pPr>
+        <w:shd w:val="clear" w:color="auto" w:fill="E2EFD9" w:themeFill="accent6" w:themeFillTint="33"/>
         <w:tabs>
           <w:tab w:val="left" w:pos="6768"/>
         </w:tabs>
@@ -16052,6 +15995,7 @@
     </w:p>
     <w:p>
       <w:pPr>
+        <w:shd w:val="clear" w:color="auto" w:fill="E2EFD9" w:themeFill="accent6" w:themeFillTint="33"/>
         <w:tabs>
           <w:tab w:val="left" w:pos="6768"/>
         </w:tabs>
@@ -16090,6 +16034,7 @@
     </w:p>
     <w:p>
       <w:pPr>
+        <w:shd w:val="clear" w:color="auto" w:fill="E2EFD9" w:themeFill="accent6" w:themeFillTint="33"/>
         <w:tabs>
           <w:tab w:val="left" w:pos="6768"/>
         </w:tabs>
@@ -16110,6 +16055,7 @@
     </w:p>
     <w:p>
       <w:pPr>
+        <w:shd w:val="clear" w:color="auto" w:fill="E2EFD9" w:themeFill="accent6" w:themeFillTint="33"/>
         <w:tabs>
           <w:tab w:val="left" w:pos="6768"/>
         </w:tabs>

</xml_diff>